<commit_message>
fix: al catálogo solo suben los códigos que tienen su ficha
Orden de Darwin: se suben los ENCONTRADOS del Excel, los 120 que tienen su
Word. Los 12 que el maestro lista sin ficha quedan FUERA hasta que Lesly
unifique el código y mande el archivo —un producto sin descripción ni foto no
se puede cotizar—, así que salen del catálogo los 9 que la carga anterior había
dejado activos y no se crea ninguno más.

El catálogo queda en 120 productos, todos con descripción y foto del Word.

Co-Authored-By: Claude Opus 5 (1M context) <noreply@anthropic.com>
</commit_message>
<xml_diff>
--- a/docs/Fichas tecnicas cargadas al CRM - revision 28-08.docx
+++ b/docs/Fichas tecnicas cargadas al CRM - revision 28-08.docx
@@ -354,7 +354,7 @@
                 <w:sz w:val="19"/>
                 <w:szCs w:val="19"/>
               </w:rPr>
-              <w:t xml:space="preserve">Del maestro sin ficha: entran igual, sin descripción ni foto</w:t>
+              <w:t xml:space="preserve">Del maestro sin ficha: quedan fuera del catálogo</w:t>
             </w:r>
           </w:p>
         </w:tc>
@@ -457,7 +457,7 @@
                 <w:sz w:val="19"/>
                 <w:szCs w:val="19"/>
               </w:rPr>
-              <w:t xml:space="preserve">6</w:t>
+              <w:t xml:space="preserve">15</w:t>
             </w:r>
           </w:p>
         </w:tc>
@@ -607,7 +607,7 @@
           <w:sz w:val="22"/>
           <w:szCs w:val="22"/>
         </w:rPr>
-        <w:t xml:space="preserve">Productos nuevos (8)</w:t>
+        <w:t xml:space="preserve">Productos nuevos (7)</w:t>
       </w:r>
     </w:p>
     <w:tbl>
@@ -1446,110 +1446,6 @@
                 <w:szCs w:val="19"/>
               </w:rPr>
               <w:t xml:space="preserve">16500.00</w:t>
-            </w:r>
-          </w:p>
-        </w:tc>
-      </w:tr>
-      <w:tr>
-        <w:tc>
-          <w:tcPr>
-            <w:tcW w:type="pct" w:w="14%"/>
-            <w:tcBorders>
-              <w:top w:val="single" w:color="D8D2D0" w:sz="1"/>
-              <w:left w:val="single" w:color="D8D2D0" w:sz="1"/>
-              <w:bottom w:val="single" w:color="D8D2D0" w:sz="1"/>
-              <w:right w:val="single" w:color="D8D2D0" w:sz="1"/>
-            </w:tcBorders>
-            <w:shd w:fill="F7F5F4" w:color="auto" w:val="clear"/>
-            <w:tcMar>
-              <w:top w:type="dxa" w:w="90"/>
-              <w:left w:type="dxa" w:w="120"/>
-              <w:bottom w:type="dxa" w:w="90"/>
-              <w:right w:type="dxa" w:w="120"/>
-            </w:tcMar>
-          </w:tcPr>
-          <w:p>
-            <w:pPr>
-              <w:spacing w:after="0" w:line="260"/>
-            </w:pPr>
-            <w:r>
-              <w:rPr>
-                <w:rFonts w:ascii="Arial" w:cs="Arial" w:eastAsia="Arial" w:hAnsi="Arial"/>
-                <w:b w:val="false"/>
-                <w:bCs w:val="false"/>
-                <w:color w:val="333333"/>
-                <w:sz w:val="19"/>
-                <w:szCs w:val="19"/>
-              </w:rPr>
-              <w:t xml:space="preserve">LAVA060</w:t>
-            </w:r>
-          </w:p>
-        </w:tc>
-        <w:tc>
-          <w:tcPr>
-            <w:tcW w:type="pct" w:w="66%"/>
-            <w:tcBorders>
-              <w:top w:val="single" w:color="D8D2D0" w:sz="1"/>
-              <w:left w:val="single" w:color="D8D2D0" w:sz="1"/>
-              <w:bottom w:val="single" w:color="D8D2D0" w:sz="1"/>
-              <w:right w:val="single" w:color="D8D2D0" w:sz="1"/>
-            </w:tcBorders>
-            <w:shd w:fill="F7F5F4" w:color="auto" w:val="clear"/>
-            <w:tcMar>
-              <w:top w:type="dxa" w:w="90"/>
-              <w:left w:type="dxa" w:w="120"/>
-              <w:bottom w:type="dxa" w:w="90"/>
-              <w:right w:type="dxa" w:w="120"/>
-            </w:tcMar>
-          </w:tcPr>
-          <w:p>
-            <w:pPr>
-              <w:spacing w:after="0" w:line="260"/>
-            </w:pPr>
-            <w:r>
-              <w:rPr>
-                <w:rFonts w:ascii="Arial" w:cs="Arial" w:eastAsia="Arial" w:hAnsi="Arial"/>
-                <w:b w:val="false"/>
-                <w:bCs w:val="false"/>
-                <w:color w:val="333333"/>
-                <w:sz w:val="19"/>
-                <w:szCs w:val="19"/>
-              </w:rPr>
-              <w:t xml:space="preserve">LAVADORA INDUSTRIAL</w:t>
-            </w:r>
-          </w:p>
-        </w:tc>
-        <w:tc>
-          <w:tcPr>
-            <w:tcW w:type="pct" w:w="20%"/>
-            <w:tcBorders>
-              <w:top w:val="single" w:color="D8D2D0" w:sz="1"/>
-              <w:left w:val="single" w:color="D8D2D0" w:sz="1"/>
-              <w:bottom w:val="single" w:color="D8D2D0" w:sz="1"/>
-              <w:right w:val="single" w:color="D8D2D0" w:sz="1"/>
-            </w:tcBorders>
-            <w:shd w:fill="F7F5F4" w:color="auto" w:val="clear"/>
-            <w:tcMar>
-              <w:top w:type="dxa" w:w="90"/>
-              <w:left w:type="dxa" w:w="120"/>
-              <w:bottom w:type="dxa" w:w="90"/>
-              <w:right w:type="dxa" w:w="120"/>
-            </w:tcMar>
-          </w:tcPr>
-          <w:p>
-            <w:pPr>
-              <w:spacing w:after="0" w:line="260"/>
-            </w:pPr>
-            <w:r>
-              <w:rPr>
-                <w:rFonts w:ascii="Arial" w:cs="Arial" w:eastAsia="Arial" w:hAnsi="Arial"/>
-                <w:b w:val="false"/>
-                <w:bCs w:val="false"/>
-                <w:color w:val="333333"/>
-                <w:sz w:val="19"/>
-                <w:szCs w:val="19"/>
-              </w:rPr>
-              <w:t xml:space="preserve">15500.00</w:t>
             </w:r>
           </w:p>
         </w:tc>
@@ -1582,7 +1478,7 @@
           <w:sz w:val="22"/>
           <w:szCs w:val="22"/>
         </w:rPr>
-        <w:t xml:space="preserve">Retirados del catálogo (6)</w:t>
+        <w:t xml:space="preserve">Retirados del catálogo (15)</w:t>
       </w:r>
     </w:p>
     <w:p>
@@ -1718,6 +1614,144 @@
                 <w:sz w:val="19"/>
                 <w:szCs w:val="19"/>
               </w:rPr>
+              <w:t xml:space="preserve">1SECU1701</w:t>
+            </w:r>
+          </w:p>
+        </w:tc>
+        <w:tc>
+          <w:tcPr>
+            <w:tcW w:type="pct" w:w="84%"/>
+            <w:tcBorders>
+              <w:top w:val="single" w:color="D8D2D0" w:sz="1"/>
+              <w:left w:val="single" w:color="D8D2D0" w:sz="1"/>
+              <w:bottom w:val="single" w:color="D8D2D0" w:sz="1"/>
+              <w:right w:val="single" w:color="D8D2D0" w:sz="1"/>
+            </w:tcBorders>
+            <w:tcMar>
+              <w:top w:type="dxa" w:w="90"/>
+              <w:left w:type="dxa" w:w="120"/>
+              <w:bottom w:type="dxa" w:w="90"/>
+              <w:right w:type="dxa" w:w="120"/>
+            </w:tcMar>
+          </w:tcPr>
+          <w:p>
+            <w:pPr>
+              <w:spacing w:after="0" w:line="260"/>
+            </w:pPr>
+            <w:r>
+              <w:rPr>
+                <w:rFonts w:ascii="Arial" w:cs="Arial" w:eastAsia="Arial" w:hAnsi="Arial"/>
+                <w:b w:val="false"/>
+                <w:bCs w:val="false"/>
+                <w:color w:val="333333"/>
+                <w:sz w:val="19"/>
+                <w:szCs w:val="19"/>
+              </w:rPr>
+              <w:t xml:space="preserve">Está en el maestro pero sin ficha: al sistema solo suben los que tienen su Word</w:t>
+            </w:r>
+          </w:p>
+        </w:tc>
+      </w:tr>
+      <w:tr>
+        <w:tc>
+          <w:tcPr>
+            <w:tcW w:type="pct" w:w="16%"/>
+            <w:tcBorders>
+              <w:top w:val="single" w:color="D8D2D0" w:sz="1"/>
+              <w:left w:val="single" w:color="D8D2D0" w:sz="1"/>
+              <w:bottom w:val="single" w:color="D8D2D0" w:sz="1"/>
+              <w:right w:val="single" w:color="D8D2D0" w:sz="1"/>
+            </w:tcBorders>
+            <w:shd w:fill="F7F5F4" w:color="auto" w:val="clear"/>
+            <w:tcMar>
+              <w:top w:type="dxa" w:w="90"/>
+              <w:left w:type="dxa" w:w="120"/>
+              <w:bottom w:type="dxa" w:w="90"/>
+              <w:right w:type="dxa" w:w="120"/>
+            </w:tcMar>
+          </w:tcPr>
+          <w:p>
+            <w:pPr>
+              <w:spacing w:after="0" w:line="260"/>
+            </w:pPr>
+            <w:r>
+              <w:rPr>
+                <w:rFonts w:ascii="Arial" w:cs="Arial" w:eastAsia="Arial" w:hAnsi="Arial"/>
+                <w:b w:val="false"/>
+                <w:bCs w:val="false"/>
+                <w:color w:val="333333"/>
+                <w:sz w:val="19"/>
+                <w:szCs w:val="19"/>
+              </w:rPr>
+              <w:t xml:space="preserve">CALM23</w:t>
+            </w:r>
+          </w:p>
+        </w:tc>
+        <w:tc>
+          <w:tcPr>
+            <w:tcW w:type="pct" w:w="84%"/>
+            <w:tcBorders>
+              <w:top w:val="single" w:color="D8D2D0" w:sz="1"/>
+              <w:left w:val="single" w:color="D8D2D0" w:sz="1"/>
+              <w:bottom w:val="single" w:color="D8D2D0" w:sz="1"/>
+              <w:right w:val="single" w:color="D8D2D0" w:sz="1"/>
+            </w:tcBorders>
+            <w:shd w:fill="F7F5F4" w:color="auto" w:val="clear"/>
+            <w:tcMar>
+              <w:top w:type="dxa" w:w="90"/>
+              <w:left w:type="dxa" w:w="120"/>
+              <w:bottom w:type="dxa" w:w="90"/>
+              <w:right w:type="dxa" w:w="120"/>
+            </w:tcMar>
+          </w:tcPr>
+          <w:p>
+            <w:pPr>
+              <w:spacing w:after="0" w:line="260"/>
+            </w:pPr>
+            <w:r>
+              <w:rPr>
+                <w:rFonts w:ascii="Arial" w:cs="Arial" w:eastAsia="Arial" w:hAnsi="Arial"/>
+                <w:b w:val="false"/>
+                <w:bCs w:val="false"/>
+                <w:color w:val="333333"/>
+                <w:sz w:val="19"/>
+                <w:szCs w:val="19"/>
+              </w:rPr>
+              <w:t xml:space="preserve">Está en el maestro pero sin ficha: al sistema solo suben los que tienen su Word</w:t>
+            </w:r>
+          </w:p>
+        </w:tc>
+      </w:tr>
+      <w:tr>
+        <w:tc>
+          <w:tcPr>
+            <w:tcW w:type="pct" w:w="16%"/>
+            <w:tcBorders>
+              <w:top w:val="single" w:color="D8D2D0" w:sz="1"/>
+              <w:left w:val="single" w:color="D8D2D0" w:sz="1"/>
+              <w:bottom w:val="single" w:color="D8D2D0" w:sz="1"/>
+              <w:right w:val="single" w:color="D8D2D0" w:sz="1"/>
+            </w:tcBorders>
+            <w:tcMar>
+              <w:top w:type="dxa" w:w="90"/>
+              <w:left w:type="dxa" w:w="120"/>
+              <w:bottom w:type="dxa" w:w="90"/>
+              <w:right w:type="dxa" w:w="120"/>
+            </w:tcMar>
+          </w:tcPr>
+          <w:p>
+            <w:pPr>
+              <w:spacing w:after="0" w:line="260"/>
+            </w:pPr>
+            <w:r>
+              <w:rPr>
+                <w:rFonts w:ascii="Arial" w:cs="Arial" w:eastAsia="Arial" w:hAnsi="Arial"/>
+                <w:b w:val="false"/>
+                <w:bCs w:val="false"/>
+                <w:color w:val="333333"/>
+                <w:sz w:val="19"/>
+                <w:szCs w:val="19"/>
+              </w:rPr>
               <w:t xml:space="preserve">CO401</w:t>
             </w:r>
           </w:p>
@@ -1925,6 +1959,489 @@
                 <w:sz w:val="19"/>
                 <w:szCs w:val="19"/>
               </w:rPr>
+              <w:t xml:space="preserve">LAV135S</w:t>
+            </w:r>
+          </w:p>
+        </w:tc>
+        <w:tc>
+          <w:tcPr>
+            <w:tcW w:type="pct" w:w="84%"/>
+            <w:tcBorders>
+              <w:top w:val="single" w:color="D8D2D0" w:sz="1"/>
+              <w:left w:val="single" w:color="D8D2D0" w:sz="1"/>
+              <w:bottom w:val="single" w:color="D8D2D0" w:sz="1"/>
+              <w:right w:val="single" w:color="D8D2D0" w:sz="1"/>
+            </w:tcBorders>
+            <w:shd w:fill="F7F5F4" w:color="auto" w:val="clear"/>
+            <w:tcMar>
+              <w:top w:type="dxa" w:w="90"/>
+              <w:left w:type="dxa" w:w="120"/>
+              <w:bottom w:type="dxa" w:w="90"/>
+              <w:right w:type="dxa" w:w="120"/>
+            </w:tcMar>
+          </w:tcPr>
+          <w:p>
+            <w:pPr>
+              <w:spacing w:after="0" w:line="260"/>
+            </w:pPr>
+            <w:r>
+              <w:rPr>
+                <w:rFonts w:ascii="Arial" w:cs="Arial" w:eastAsia="Arial" w:hAnsi="Arial"/>
+                <w:b w:val="false"/>
+                <w:bCs w:val="false"/>
+                <w:color w:val="333333"/>
+                <w:sz w:val="19"/>
+                <w:szCs w:val="19"/>
+              </w:rPr>
+              <w:t xml:space="preserve">Está en el maestro pero sin ficha: al sistema solo suben los que tienen su Word</w:t>
+            </w:r>
+          </w:p>
+        </w:tc>
+      </w:tr>
+      <w:tr>
+        <w:tc>
+          <w:tcPr>
+            <w:tcW w:type="pct" w:w="16%"/>
+            <w:tcBorders>
+              <w:top w:val="single" w:color="D8D2D0" w:sz="1"/>
+              <w:left w:val="single" w:color="D8D2D0" w:sz="1"/>
+              <w:bottom w:val="single" w:color="D8D2D0" w:sz="1"/>
+              <w:right w:val="single" w:color="D8D2D0" w:sz="1"/>
+            </w:tcBorders>
+            <w:tcMar>
+              <w:top w:type="dxa" w:w="90"/>
+              <w:left w:type="dxa" w:w="120"/>
+              <w:bottom w:type="dxa" w:w="90"/>
+              <w:right w:type="dxa" w:w="120"/>
+            </w:tcMar>
+          </w:tcPr>
+          <w:p>
+            <w:pPr>
+              <w:spacing w:after="0" w:line="260"/>
+            </w:pPr>
+            <w:r>
+              <w:rPr>
+                <w:rFonts w:ascii="Arial" w:cs="Arial" w:eastAsia="Arial" w:hAnsi="Arial"/>
+                <w:b w:val="false"/>
+                <w:bCs w:val="false"/>
+                <w:color w:val="333333"/>
+                <w:sz w:val="19"/>
+                <w:szCs w:val="19"/>
+              </w:rPr>
+              <w:t xml:space="preserve">LAVA060</w:t>
+            </w:r>
+          </w:p>
+        </w:tc>
+        <w:tc>
+          <w:tcPr>
+            <w:tcW w:type="pct" w:w="84%"/>
+            <w:tcBorders>
+              <w:top w:val="single" w:color="D8D2D0" w:sz="1"/>
+              <w:left w:val="single" w:color="D8D2D0" w:sz="1"/>
+              <w:bottom w:val="single" w:color="D8D2D0" w:sz="1"/>
+              <w:right w:val="single" w:color="D8D2D0" w:sz="1"/>
+            </w:tcBorders>
+            <w:tcMar>
+              <w:top w:type="dxa" w:w="90"/>
+              <w:left w:type="dxa" w:w="120"/>
+              <w:bottom w:type="dxa" w:w="90"/>
+              <w:right w:type="dxa" w:w="120"/>
+            </w:tcMar>
+          </w:tcPr>
+          <w:p>
+            <w:pPr>
+              <w:spacing w:after="0" w:line="260"/>
+            </w:pPr>
+            <w:r>
+              <w:rPr>
+                <w:rFonts w:ascii="Arial" w:cs="Arial" w:eastAsia="Arial" w:hAnsi="Arial"/>
+                <w:b w:val="false"/>
+                <w:bCs w:val="false"/>
+                <w:color w:val="333333"/>
+                <w:sz w:val="19"/>
+                <w:szCs w:val="19"/>
+              </w:rPr>
+              <w:t xml:space="preserve">Está en el maestro pero sin ficha: al sistema solo suben los que tienen su Word</w:t>
+            </w:r>
+          </w:p>
+        </w:tc>
+      </w:tr>
+      <w:tr>
+        <w:tc>
+          <w:tcPr>
+            <w:tcW w:type="pct" w:w="16%"/>
+            <w:tcBorders>
+              <w:top w:val="single" w:color="D8D2D0" w:sz="1"/>
+              <w:left w:val="single" w:color="D8D2D0" w:sz="1"/>
+              <w:bottom w:val="single" w:color="D8D2D0" w:sz="1"/>
+              <w:right w:val="single" w:color="D8D2D0" w:sz="1"/>
+            </w:tcBorders>
+            <w:shd w:fill="F7F5F4" w:color="auto" w:val="clear"/>
+            <w:tcMar>
+              <w:top w:type="dxa" w:w="90"/>
+              <w:left w:type="dxa" w:w="120"/>
+              <w:bottom w:type="dxa" w:w="90"/>
+              <w:right w:type="dxa" w:w="120"/>
+            </w:tcMar>
+          </w:tcPr>
+          <w:p>
+            <w:pPr>
+              <w:spacing w:after="0" w:line="260"/>
+            </w:pPr>
+            <w:r>
+              <w:rPr>
+                <w:rFonts w:ascii="Arial" w:cs="Arial" w:eastAsia="Arial" w:hAnsi="Arial"/>
+                <w:b w:val="false"/>
+                <w:bCs w:val="false"/>
+                <w:color w:val="333333"/>
+                <w:sz w:val="19"/>
+                <w:szCs w:val="19"/>
+              </w:rPr>
+              <w:t xml:space="preserve">SEC75E</w:t>
+            </w:r>
+          </w:p>
+        </w:tc>
+        <w:tc>
+          <w:tcPr>
+            <w:tcW w:type="pct" w:w="84%"/>
+            <w:tcBorders>
+              <w:top w:val="single" w:color="D8D2D0" w:sz="1"/>
+              <w:left w:val="single" w:color="D8D2D0" w:sz="1"/>
+              <w:bottom w:val="single" w:color="D8D2D0" w:sz="1"/>
+              <w:right w:val="single" w:color="D8D2D0" w:sz="1"/>
+            </w:tcBorders>
+            <w:shd w:fill="F7F5F4" w:color="auto" w:val="clear"/>
+            <w:tcMar>
+              <w:top w:type="dxa" w:w="90"/>
+              <w:left w:type="dxa" w:w="120"/>
+              <w:bottom w:type="dxa" w:w="90"/>
+              <w:right w:type="dxa" w:w="120"/>
+            </w:tcMar>
+          </w:tcPr>
+          <w:p>
+            <w:pPr>
+              <w:spacing w:after="0" w:line="260"/>
+            </w:pPr>
+            <w:r>
+              <w:rPr>
+                <w:rFonts w:ascii="Arial" w:cs="Arial" w:eastAsia="Arial" w:hAnsi="Arial"/>
+                <w:b w:val="false"/>
+                <w:bCs w:val="false"/>
+                <w:color w:val="333333"/>
+                <w:sz w:val="19"/>
+                <w:szCs w:val="19"/>
+              </w:rPr>
+              <w:t xml:space="preserve">Está en el maestro pero sin ficha: al sistema solo suben los que tienen su Word</w:t>
+            </w:r>
+          </w:p>
+        </w:tc>
+      </w:tr>
+      <w:tr>
+        <w:tc>
+          <w:tcPr>
+            <w:tcW w:type="pct" w:w="16%"/>
+            <w:tcBorders>
+              <w:top w:val="single" w:color="D8D2D0" w:sz="1"/>
+              <w:left w:val="single" w:color="D8D2D0" w:sz="1"/>
+              <w:bottom w:val="single" w:color="D8D2D0" w:sz="1"/>
+              <w:right w:val="single" w:color="D8D2D0" w:sz="1"/>
+            </w:tcBorders>
+            <w:tcMar>
+              <w:top w:type="dxa" w:w="90"/>
+              <w:left w:type="dxa" w:w="120"/>
+              <w:bottom w:type="dxa" w:w="90"/>
+              <w:right w:type="dxa" w:w="120"/>
+            </w:tcMar>
+          </w:tcPr>
+          <w:p>
+            <w:pPr>
+              <w:spacing w:after="0" w:line="260"/>
+            </w:pPr>
+            <w:r>
+              <w:rPr>
+                <w:rFonts w:ascii="Arial" w:cs="Arial" w:eastAsia="Arial" w:hAnsi="Arial"/>
+                <w:b w:val="false"/>
+                <w:bCs w:val="false"/>
+                <w:color w:val="333333"/>
+                <w:sz w:val="19"/>
+                <w:szCs w:val="19"/>
+              </w:rPr>
+              <w:t xml:space="preserve">SEC75E2</w:t>
+            </w:r>
+          </w:p>
+        </w:tc>
+        <w:tc>
+          <w:tcPr>
+            <w:tcW w:type="pct" w:w="84%"/>
+            <w:tcBorders>
+              <w:top w:val="single" w:color="D8D2D0" w:sz="1"/>
+              <w:left w:val="single" w:color="D8D2D0" w:sz="1"/>
+              <w:bottom w:val="single" w:color="D8D2D0" w:sz="1"/>
+              <w:right w:val="single" w:color="D8D2D0" w:sz="1"/>
+            </w:tcBorders>
+            <w:tcMar>
+              <w:top w:type="dxa" w:w="90"/>
+              <w:left w:type="dxa" w:w="120"/>
+              <w:bottom w:type="dxa" w:w="90"/>
+              <w:right w:type="dxa" w:w="120"/>
+            </w:tcMar>
+          </w:tcPr>
+          <w:p>
+            <w:pPr>
+              <w:spacing w:after="0" w:line="260"/>
+            </w:pPr>
+            <w:r>
+              <w:rPr>
+                <w:rFonts w:ascii="Arial" w:cs="Arial" w:eastAsia="Arial" w:hAnsi="Arial"/>
+                <w:b w:val="false"/>
+                <w:bCs w:val="false"/>
+                <w:color w:val="333333"/>
+                <w:sz w:val="19"/>
+                <w:szCs w:val="19"/>
+              </w:rPr>
+              <w:t xml:space="preserve">Está en el maestro pero sin ficha: al sistema solo suben los que tienen su Word</w:t>
+            </w:r>
+          </w:p>
+        </w:tc>
+      </w:tr>
+      <w:tr>
+        <w:tc>
+          <w:tcPr>
+            <w:tcW w:type="pct" w:w="16%"/>
+            <w:tcBorders>
+              <w:top w:val="single" w:color="D8D2D0" w:sz="1"/>
+              <w:left w:val="single" w:color="D8D2D0" w:sz="1"/>
+              <w:bottom w:val="single" w:color="D8D2D0" w:sz="1"/>
+              <w:right w:val="single" w:color="D8D2D0" w:sz="1"/>
+            </w:tcBorders>
+            <w:shd w:fill="F7F5F4" w:color="auto" w:val="clear"/>
+            <w:tcMar>
+              <w:top w:type="dxa" w:w="90"/>
+              <w:left w:type="dxa" w:w="120"/>
+              <w:bottom w:type="dxa" w:w="90"/>
+              <w:right w:type="dxa" w:w="120"/>
+            </w:tcMar>
+          </w:tcPr>
+          <w:p>
+            <w:pPr>
+              <w:spacing w:after="0" w:line="260"/>
+            </w:pPr>
+            <w:r>
+              <w:rPr>
+                <w:rFonts w:ascii="Arial" w:cs="Arial" w:eastAsia="Arial" w:hAnsi="Arial"/>
+                <w:b w:val="false"/>
+                <w:bCs w:val="false"/>
+                <w:color w:val="333333"/>
+                <w:sz w:val="19"/>
+                <w:szCs w:val="19"/>
+              </w:rPr>
+              <w:t xml:space="preserve">SEC75E3</w:t>
+            </w:r>
+          </w:p>
+        </w:tc>
+        <w:tc>
+          <w:tcPr>
+            <w:tcW w:type="pct" w:w="84%"/>
+            <w:tcBorders>
+              <w:top w:val="single" w:color="D8D2D0" w:sz="1"/>
+              <w:left w:val="single" w:color="D8D2D0" w:sz="1"/>
+              <w:bottom w:val="single" w:color="D8D2D0" w:sz="1"/>
+              <w:right w:val="single" w:color="D8D2D0" w:sz="1"/>
+            </w:tcBorders>
+            <w:shd w:fill="F7F5F4" w:color="auto" w:val="clear"/>
+            <w:tcMar>
+              <w:top w:type="dxa" w:w="90"/>
+              <w:left w:type="dxa" w:w="120"/>
+              <w:bottom w:type="dxa" w:w="90"/>
+              <w:right w:type="dxa" w:w="120"/>
+            </w:tcMar>
+          </w:tcPr>
+          <w:p>
+            <w:pPr>
+              <w:spacing w:after="0" w:line="260"/>
+            </w:pPr>
+            <w:r>
+              <w:rPr>
+                <w:rFonts w:ascii="Arial" w:cs="Arial" w:eastAsia="Arial" w:hAnsi="Arial"/>
+                <w:b w:val="false"/>
+                <w:bCs w:val="false"/>
+                <w:color w:val="333333"/>
+                <w:sz w:val="19"/>
+                <w:szCs w:val="19"/>
+              </w:rPr>
+              <w:t xml:space="preserve">Está en el maestro pero sin ficha: al sistema solo suben los que tienen su Word</w:t>
+            </w:r>
+          </w:p>
+        </w:tc>
+      </w:tr>
+      <w:tr>
+        <w:tc>
+          <w:tcPr>
+            <w:tcW w:type="pct" w:w="16%"/>
+            <w:tcBorders>
+              <w:top w:val="single" w:color="D8D2D0" w:sz="1"/>
+              <w:left w:val="single" w:color="D8D2D0" w:sz="1"/>
+              <w:bottom w:val="single" w:color="D8D2D0" w:sz="1"/>
+              <w:right w:val="single" w:color="D8D2D0" w:sz="1"/>
+            </w:tcBorders>
+            <w:tcMar>
+              <w:top w:type="dxa" w:w="90"/>
+              <w:left w:type="dxa" w:w="120"/>
+              <w:bottom w:type="dxa" w:w="90"/>
+              <w:right w:type="dxa" w:w="120"/>
+            </w:tcMar>
+          </w:tcPr>
+          <w:p>
+            <w:pPr>
+              <w:spacing w:after="0" w:line="260"/>
+            </w:pPr>
+            <w:r>
+              <w:rPr>
+                <w:rFonts w:ascii="Arial" w:cs="Arial" w:eastAsia="Arial" w:hAnsi="Arial"/>
+                <w:b w:val="false"/>
+                <w:bCs w:val="false"/>
+                <w:color w:val="333333"/>
+                <w:sz w:val="19"/>
+                <w:szCs w:val="19"/>
+              </w:rPr>
+              <w:t xml:space="preserve">SECNSEN</w:t>
+            </w:r>
+          </w:p>
+        </w:tc>
+        <w:tc>
+          <w:tcPr>
+            <w:tcW w:type="pct" w:w="84%"/>
+            <w:tcBorders>
+              <w:top w:val="single" w:color="D8D2D0" w:sz="1"/>
+              <w:left w:val="single" w:color="D8D2D0" w:sz="1"/>
+              <w:bottom w:val="single" w:color="D8D2D0" w:sz="1"/>
+              <w:right w:val="single" w:color="D8D2D0" w:sz="1"/>
+            </w:tcBorders>
+            <w:tcMar>
+              <w:top w:type="dxa" w:w="90"/>
+              <w:left w:type="dxa" w:w="120"/>
+              <w:bottom w:type="dxa" w:w="90"/>
+              <w:right w:type="dxa" w:w="120"/>
+            </w:tcMar>
+          </w:tcPr>
+          <w:p>
+            <w:pPr>
+              <w:spacing w:after="0" w:line="260"/>
+            </w:pPr>
+            <w:r>
+              <w:rPr>
+                <w:rFonts w:ascii="Arial" w:cs="Arial" w:eastAsia="Arial" w:hAnsi="Arial"/>
+                <w:b w:val="false"/>
+                <w:bCs w:val="false"/>
+                <w:color w:val="333333"/>
+                <w:sz w:val="19"/>
+                <w:szCs w:val="19"/>
+              </w:rPr>
+              <w:t xml:space="preserve">Está en el maestro pero sin ficha: al sistema solo suben los que tienen su Word</w:t>
+            </w:r>
+          </w:p>
+        </w:tc>
+      </w:tr>
+      <w:tr>
+        <w:tc>
+          <w:tcPr>
+            <w:tcW w:type="pct" w:w="16%"/>
+            <w:tcBorders>
+              <w:top w:val="single" w:color="D8D2D0" w:sz="1"/>
+              <w:left w:val="single" w:color="D8D2D0" w:sz="1"/>
+              <w:bottom w:val="single" w:color="D8D2D0" w:sz="1"/>
+              <w:right w:val="single" w:color="D8D2D0" w:sz="1"/>
+            </w:tcBorders>
+            <w:shd w:fill="F7F5F4" w:color="auto" w:val="clear"/>
+            <w:tcMar>
+              <w:top w:type="dxa" w:w="90"/>
+              <w:left w:type="dxa" w:w="120"/>
+              <w:bottom w:type="dxa" w:w="90"/>
+              <w:right w:type="dxa" w:w="120"/>
+            </w:tcMar>
+          </w:tcPr>
+          <w:p>
+            <w:pPr>
+              <w:spacing w:after="0" w:line="260"/>
+            </w:pPr>
+            <w:r>
+              <w:rPr>
+                <w:rFonts w:ascii="Arial" w:cs="Arial" w:eastAsia="Arial" w:hAnsi="Arial"/>
+                <w:b w:val="false"/>
+                <w:bCs w:val="false"/>
+                <w:color w:val="333333"/>
+                <w:sz w:val="19"/>
+                <w:szCs w:val="19"/>
+              </w:rPr>
+              <w:t xml:space="preserve">SECU754</w:t>
+            </w:r>
+          </w:p>
+        </w:tc>
+        <w:tc>
+          <w:tcPr>
+            <w:tcW w:type="pct" w:w="84%"/>
+            <w:tcBorders>
+              <w:top w:val="single" w:color="D8D2D0" w:sz="1"/>
+              <w:left w:val="single" w:color="D8D2D0" w:sz="1"/>
+              <w:bottom w:val="single" w:color="D8D2D0" w:sz="1"/>
+              <w:right w:val="single" w:color="D8D2D0" w:sz="1"/>
+            </w:tcBorders>
+            <w:shd w:fill="F7F5F4" w:color="auto" w:val="clear"/>
+            <w:tcMar>
+              <w:top w:type="dxa" w:w="90"/>
+              <w:left w:type="dxa" w:w="120"/>
+              <w:bottom w:type="dxa" w:w="90"/>
+              <w:right w:type="dxa" w:w="120"/>
+            </w:tcMar>
+          </w:tcPr>
+          <w:p>
+            <w:pPr>
+              <w:spacing w:after="0" w:line="260"/>
+            </w:pPr>
+            <w:r>
+              <w:rPr>
+                <w:rFonts w:ascii="Arial" w:cs="Arial" w:eastAsia="Arial" w:hAnsi="Arial"/>
+                <w:b w:val="false"/>
+                <w:bCs w:val="false"/>
+                <w:color w:val="333333"/>
+                <w:sz w:val="19"/>
+                <w:szCs w:val="19"/>
+              </w:rPr>
+              <w:t xml:space="preserve">Está en el maestro pero sin ficha: al sistema solo suben los que tienen su Word</w:t>
+            </w:r>
+          </w:p>
+        </w:tc>
+      </w:tr>
+      <w:tr>
+        <w:tc>
+          <w:tcPr>
+            <w:tcW w:type="pct" w:w="16%"/>
+            <w:tcBorders>
+              <w:top w:val="single" w:color="D8D2D0" w:sz="1"/>
+              <w:left w:val="single" w:color="D8D2D0" w:sz="1"/>
+              <w:bottom w:val="single" w:color="D8D2D0" w:sz="1"/>
+              <w:right w:val="single" w:color="D8D2D0" w:sz="1"/>
+            </w:tcBorders>
+            <w:tcMar>
+              <w:top w:type="dxa" w:w="90"/>
+              <w:left w:type="dxa" w:w="120"/>
+              <w:bottom w:type="dxa" w:w="90"/>
+              <w:right w:type="dxa" w:w="120"/>
+            </w:tcMar>
+          </w:tcPr>
+          <w:p>
+            <w:pPr>
+              <w:spacing w:after="0" w:line="260"/>
+            </w:pPr>
+            <w:r>
+              <w:rPr>
+                <w:rFonts w:ascii="Arial" w:cs="Arial" w:eastAsia="Arial" w:hAnsi="Arial"/>
+                <w:b w:val="false"/>
+                <w:bCs w:val="false"/>
+                <w:color w:val="333333"/>
+                <w:sz w:val="19"/>
+                <w:szCs w:val="19"/>
+              </w:rPr>
               <w:t xml:space="preserve">SECU75E</w:t>
             </w:r>
           </w:p>
@@ -1938,28 +2455,27 @@
               <w:bottom w:val="single" w:color="D8D2D0" w:sz="1"/>
               <w:right w:val="single" w:color="D8D2D0" w:sz="1"/>
             </w:tcBorders>
-            <w:shd w:fill="F7F5F4" w:color="auto" w:val="clear"/>
-            <w:tcMar>
-              <w:top w:type="dxa" w:w="90"/>
-              <w:left w:type="dxa" w:w="120"/>
-              <w:bottom w:type="dxa" w:w="90"/>
-              <w:right w:type="dxa" w:w="120"/>
-            </w:tcMar>
-          </w:tcPr>
-          <w:p>
-            <w:pPr>
-              <w:spacing w:after="0" w:line="260"/>
-            </w:pPr>
-            <w:r>
-              <w:rPr>
-                <w:rFonts w:ascii="Arial" w:cs="Arial" w:eastAsia="Arial" w:hAnsi="Arial"/>
-                <w:b w:val="false"/>
-                <w:bCs w:val="false"/>
-                <w:color w:val="333333"/>
-                <w:sz w:val="19"/>
-                <w:szCs w:val="19"/>
-              </w:rPr>
-              <w:t xml:space="preserve">El maestro ya no lo lista: el mismo equipo figura con otro código</w:t>
+            <w:tcMar>
+              <w:top w:type="dxa" w:w="90"/>
+              <w:left w:type="dxa" w:w="120"/>
+              <w:bottom w:type="dxa" w:w="90"/>
+              <w:right w:type="dxa" w:w="120"/>
+            </w:tcMar>
+          </w:tcPr>
+          <w:p>
+            <w:pPr>
+              <w:spacing w:after="0" w:line="260"/>
+            </w:pPr>
+            <w:r>
+              <w:rPr>
+                <w:rFonts w:ascii="Arial" w:cs="Arial" w:eastAsia="Arial" w:hAnsi="Arial"/>
+                <w:b w:val="false"/>
+                <w:bCs w:val="false"/>
+                <w:color w:val="333333"/>
+                <w:sz w:val="19"/>
+                <w:szCs w:val="19"/>
+              </w:rPr>
+              <w:t xml:space="preserve">El maestro v2 ya no lo lista; el mismo equipo figura con otro código</w:t>
             </w:r>
           </w:p>
         </w:tc>
@@ -1974,6 +2490,7 @@
               <w:bottom w:val="single" w:color="D8D2D0" w:sz="1"/>
               <w:right w:val="single" w:color="D8D2D0" w:sz="1"/>
             </w:tcBorders>
+            <w:shd w:fill="F7F5F4" w:color="auto" w:val="clear"/>
             <w:tcMar>
               <w:top w:type="dxa" w:w="90"/>
               <w:left w:type="dxa" w:w="120"/>
@@ -2007,27 +2524,28 @@
               <w:bottom w:val="single" w:color="D8D2D0" w:sz="1"/>
               <w:right w:val="single" w:color="D8D2D0" w:sz="1"/>
             </w:tcBorders>
-            <w:tcMar>
-              <w:top w:type="dxa" w:w="90"/>
-              <w:left w:type="dxa" w:w="120"/>
-              <w:bottom w:type="dxa" w:w="90"/>
-              <w:right w:type="dxa" w:w="120"/>
-            </w:tcMar>
-          </w:tcPr>
-          <w:p>
-            <w:pPr>
-              <w:spacing w:after="0" w:line="260"/>
-            </w:pPr>
-            <w:r>
-              <w:rPr>
-                <w:rFonts w:ascii="Arial" w:cs="Arial" w:eastAsia="Arial" w:hAnsi="Arial"/>
-                <w:b w:val="false"/>
-                <w:bCs w:val="false"/>
-                <w:color w:val="333333"/>
-                <w:sz w:val="19"/>
-                <w:szCs w:val="19"/>
-              </w:rPr>
-              <w:t xml:space="preserve">El maestro ya no lo lista: el mismo equipo figura con otro código</w:t>
+            <w:shd w:fill="F7F5F4" w:color="auto" w:val="clear"/>
+            <w:tcMar>
+              <w:top w:type="dxa" w:w="90"/>
+              <w:left w:type="dxa" w:w="120"/>
+              <w:bottom w:type="dxa" w:w="90"/>
+              <w:right w:type="dxa" w:w="120"/>
+            </w:tcMar>
+          </w:tcPr>
+          <w:p>
+            <w:pPr>
+              <w:spacing w:after="0" w:line="260"/>
+            </w:pPr>
+            <w:r>
+              <w:rPr>
+                <w:rFonts w:ascii="Arial" w:cs="Arial" w:eastAsia="Arial" w:hAnsi="Arial"/>
+                <w:b w:val="false"/>
+                <w:bCs w:val="false"/>
+                <w:color w:val="333333"/>
+                <w:sz w:val="19"/>
+                <w:szCs w:val="19"/>
+              </w:rPr>
+              <w:t xml:space="preserve">El maestro v2 ya no lo lista; el mismo equipo figura con otro código</w:t>
             </w:r>
           </w:p>
         </w:tc>
@@ -2042,7 +2560,6 @@
               <w:bottom w:val="single" w:color="D8D2D0" w:sz="1"/>
               <w:right w:val="single" w:color="D8D2D0" w:sz="1"/>
             </w:tcBorders>
-            <w:shd w:fill="F7F5F4" w:color="auto" w:val="clear"/>
             <w:tcMar>
               <w:top w:type="dxa" w:w="90"/>
               <w:left w:type="dxa" w:w="120"/>
@@ -2076,28 +2593,27 @@
               <w:bottom w:val="single" w:color="D8D2D0" w:sz="1"/>
               <w:right w:val="single" w:color="D8D2D0" w:sz="1"/>
             </w:tcBorders>
-            <w:shd w:fill="F7F5F4" w:color="auto" w:val="clear"/>
-            <w:tcMar>
-              <w:top w:type="dxa" w:w="90"/>
-              <w:left w:type="dxa" w:w="120"/>
-              <w:bottom w:type="dxa" w:w="90"/>
-              <w:right w:type="dxa" w:w="120"/>
-            </w:tcMar>
-          </w:tcPr>
-          <w:p>
-            <w:pPr>
-              <w:spacing w:after="0" w:line="260"/>
-            </w:pPr>
-            <w:r>
-              <w:rPr>
-                <w:rFonts w:ascii="Arial" w:cs="Arial" w:eastAsia="Arial" w:hAnsi="Arial"/>
-                <w:b w:val="false"/>
-                <w:bCs w:val="false"/>
-                <w:color w:val="333333"/>
-                <w:sz w:val="19"/>
-                <w:szCs w:val="19"/>
-              </w:rPr>
-              <w:t xml:space="preserve">El maestro ya no lo lista: el mismo equipo figura con otro código</w:t>
+            <w:tcMar>
+              <w:top w:type="dxa" w:w="90"/>
+              <w:left w:type="dxa" w:w="120"/>
+              <w:bottom w:type="dxa" w:w="90"/>
+              <w:right w:type="dxa" w:w="120"/>
+            </w:tcMar>
+          </w:tcPr>
+          <w:p>
+            <w:pPr>
+              <w:spacing w:after="0" w:line="260"/>
+            </w:pPr>
+            <w:r>
+              <w:rPr>
+                <w:rFonts w:ascii="Arial" w:cs="Arial" w:eastAsia="Arial" w:hAnsi="Arial"/>
+                <w:b w:val="false"/>
+                <w:bCs w:val="false"/>
+                <w:color w:val="333333"/>
+                <w:sz w:val="19"/>
+                <w:szCs w:val="19"/>
+              </w:rPr>
+              <w:t xml:space="preserve">El maestro v2 ya no lo lista; el mismo equipo figura con otro código</w:t>
             </w:r>
           </w:p>
         </w:tc>
@@ -2130,7 +2646,7 @@
           <w:sz w:val="22"/>
           <w:szCs w:val="22"/>
         </w:rPr>
-        <w:t xml:space="preserve">Precios actualizados (14)</w:t>
+        <w:t xml:space="preserve">Precios actualizados (13)</w:t>
       </w:r>
     </w:p>
     <w:p>
@@ -3025,7 +3541,7 @@
                 <w:sz w:val="19"/>
                 <w:szCs w:val="19"/>
               </w:rPr>
-              <w:t xml:space="preserve">LAVA060</w:t>
+              <w:t xml:space="preserve">SECU752</w:t>
             </w:r>
           </w:p>
         </w:tc>
@@ -3059,7 +3575,7 @@
                 <w:sz w:val="19"/>
                 <w:szCs w:val="19"/>
               </w:rPr>
-              <w:t xml:space="preserve">15,500</w:t>
+              <w:t xml:space="preserve">11,950</w:t>
             </w:r>
           </w:p>
         </w:tc>
@@ -3094,7 +3610,7 @@
                 <w:sz w:val="19"/>
                 <w:szCs w:val="19"/>
               </w:rPr>
-              <w:t xml:space="preserve">SECU752</w:t>
+              <w:t xml:space="preserve">SECU755</w:t>
             </w:r>
           </w:p>
         </w:tc>
@@ -3107,76 +3623,6 @@
               <w:bottom w:val="single" w:color="D8D2D0" w:sz="1"/>
               <w:right w:val="single" w:color="D8D2D0" w:sz="1"/>
             </w:tcBorders>
-            <w:tcMar>
-              <w:top w:type="dxa" w:w="90"/>
-              <w:left w:type="dxa" w:w="120"/>
-              <w:bottom w:type="dxa" w:w="90"/>
-              <w:right w:type="dxa" w:w="120"/>
-            </w:tcMar>
-          </w:tcPr>
-          <w:p>
-            <w:pPr>
-              <w:spacing w:after="0" w:line="260"/>
-            </w:pPr>
-            <w:r>
-              <w:rPr>
-                <w:rFonts w:ascii="Arial" w:cs="Arial" w:eastAsia="Arial" w:hAnsi="Arial"/>
-                <w:b w:val="false"/>
-                <w:bCs w:val="false"/>
-                <w:color w:val="333333"/>
-                <w:sz w:val="19"/>
-                <w:szCs w:val="19"/>
-              </w:rPr>
-              <w:t xml:space="preserve">11,950</w:t>
-            </w:r>
-          </w:p>
-        </w:tc>
-      </w:tr>
-      <w:tr>
-        <w:tc>
-          <w:tcPr>
-            <w:tcW w:type="pct" w:w="50%"/>
-            <w:tcBorders>
-              <w:top w:val="single" w:color="D8D2D0" w:sz="1"/>
-              <w:left w:val="single" w:color="D8D2D0" w:sz="1"/>
-              <w:bottom w:val="single" w:color="D8D2D0" w:sz="1"/>
-              <w:right w:val="single" w:color="D8D2D0" w:sz="1"/>
-            </w:tcBorders>
-            <w:shd w:fill="F7F5F4" w:color="auto" w:val="clear"/>
-            <w:tcMar>
-              <w:top w:type="dxa" w:w="90"/>
-              <w:left w:type="dxa" w:w="120"/>
-              <w:bottom w:type="dxa" w:w="90"/>
-              <w:right w:type="dxa" w:w="120"/>
-            </w:tcMar>
-          </w:tcPr>
-          <w:p>
-            <w:pPr>
-              <w:spacing w:after="0" w:line="260"/>
-            </w:pPr>
-            <w:r>
-              <w:rPr>
-                <w:rFonts w:ascii="Arial" w:cs="Arial" w:eastAsia="Arial" w:hAnsi="Arial"/>
-                <w:b w:val="false"/>
-                <w:bCs w:val="false"/>
-                <w:color w:val="333333"/>
-                <w:sz w:val="19"/>
-                <w:szCs w:val="19"/>
-              </w:rPr>
-              <w:t xml:space="preserve">SECU755</w:t>
-            </w:r>
-          </w:p>
-        </w:tc>
-        <w:tc>
-          <w:tcPr>
-            <w:tcW w:type="pct" w:w="50%"/>
-            <w:tcBorders>
-              <w:top w:val="single" w:color="D8D2D0" w:sz="1"/>
-              <w:left w:val="single" w:color="D8D2D0" w:sz="1"/>
-              <w:bottom w:val="single" w:color="D8D2D0" w:sz="1"/>
-              <w:right w:val="single" w:color="D8D2D0" w:sz="1"/>
-            </w:tcBorders>
-            <w:shd w:fill="F7F5F4" w:color="auto" w:val="clear"/>
             <w:tcMar>
               <w:top w:type="dxa" w:w="90"/>
               <w:left w:type="dxa" w:w="120"/>
@@ -3222,7 +3668,7 @@
           <w:sz w:val="26"/>
           <w:szCs w:val="26"/>
         </w:rPr>
-        <w:t xml:space="preserve">3 · LOS 9 CÓDIGOS QUE ENTRARON SIN FICHA</w:t>
+        <w:t xml:space="preserve">3 · LOS 12 CÓDIGOS QUE QUEDARON FUERA DEL CATÁLOGO</w:t>
       </w:r>
     </w:p>
     <w:p>
@@ -3236,7 +3682,7 @@
           <w:sz w:val="21"/>
           <w:szCs w:val="21"/>
         </w:rPr>
-        <w:t xml:space="preserve">Estos códigos figuran en el maestro pero no tienen Word, así que en el CRM están sin descripción ni foto: su cotización sale con la página de ficha en blanco. En casi todos el equipo SÍ tiene ficha, pero guardada con otro código —el mismo equipo está codificado de dos maneras en los Excels—, y eso es lo que hay que unificar.</w:t>
+        <w:t xml:space="preserve">Estos códigos figuran en el maestro pero no tienen Word. Al sistema suben únicamente los que tienen ficha, así que quedaron fuera del catálogo: un producto sin descripción ni foto no se puede cotizar. En casi todos el equipo SÍ tiene ficha, pero guardada con otro código —el mismo equipo está codificado de dos maneras en los Excels—, y eso es lo que hay que unificar para que entren.</w:t>
       </w:r>
     </w:p>
     <w:p>
@@ -3614,6 +4060,313 @@
                 <w:sz w:val="19"/>
                 <w:szCs w:val="19"/>
               </w:rPr>
+              <w:t xml:space="preserve">CO401</w:t>
+            </w:r>
+          </w:p>
+        </w:tc>
+        <w:tc>
+          <w:tcPr>
+            <w:tcW w:type="pct" w:w="38%"/>
+            <w:tcBorders>
+              <w:top w:val="single" w:color="D8D2D0" w:sz="1"/>
+              <w:left w:val="single" w:color="D8D2D0" w:sz="1"/>
+              <w:bottom w:val="single" w:color="D8D2D0" w:sz="1"/>
+              <w:right w:val="single" w:color="D8D2D0" w:sz="1"/>
+            </w:tcBorders>
+            <w:tcMar>
+              <w:top w:type="dxa" w:w="90"/>
+              <w:left w:type="dxa" w:w="120"/>
+              <w:bottom w:type="dxa" w:w="90"/>
+              <w:right w:type="dxa" w:w="120"/>
+            </w:tcMar>
+          </w:tcPr>
+          <w:p>
+            <w:pPr>
+              <w:spacing w:after="0" w:line="260"/>
+            </w:pPr>
+            <w:r>
+              <w:rPr>
+                <w:rFonts w:ascii="Arial" w:cs="Arial" w:eastAsia="Arial" w:hAnsi="Arial"/>
+                <w:b w:val="false"/>
+                <w:bCs w:val="false"/>
+                <w:color w:val="333333"/>
+                <w:sz w:val="19"/>
+                <w:szCs w:val="19"/>
+              </w:rPr>
+              <w:t xml:space="preserve">COCHE UTILITARIO DE PLASTICO MOD. HM-401, 5"…</w:t>
+            </w:r>
+          </w:p>
+        </w:tc>
+        <w:tc>
+          <w:tcPr>
+            <w:tcW w:type="pct" w:w="50%"/>
+            <w:tcBorders>
+              <w:top w:val="single" w:color="D8D2D0" w:sz="1"/>
+              <w:left w:val="single" w:color="D8D2D0" w:sz="1"/>
+              <w:bottom w:val="single" w:color="D8D2D0" w:sz="1"/>
+              <w:right w:val="single" w:color="D8D2D0" w:sz="1"/>
+            </w:tcBorders>
+            <w:tcMar>
+              <w:top w:type="dxa" w:w="90"/>
+              <w:left w:type="dxa" w:w="120"/>
+              <w:bottom w:type="dxa" w:w="90"/>
+              <w:right w:type="dxa" w:w="120"/>
+            </w:tcMar>
+          </w:tcPr>
+          <w:p>
+            <w:pPr>
+              <w:spacing w:after="0" w:line="260"/>
+            </w:pPr>
+            <w:r>
+              <w:rPr>
+                <w:rFonts w:ascii="Arial" w:cs="Arial" w:eastAsia="Arial" w:hAnsi="Arial"/>
+                <w:b w:val="false"/>
+                <w:bCs w:val="false"/>
+                <w:color w:val="333333"/>
+                <w:sz w:val="19"/>
+                <w:szCs w:val="19"/>
+              </w:rPr>
+              <w:t xml:space="preserve">EL MISMO EQUIPO ESTA CODIFICADO TAMBIEN COMO CO401A y ESE SI TIENE FICHA…</w:t>
+            </w:r>
+          </w:p>
+        </w:tc>
+      </w:tr>
+      <w:tr>
+        <w:tc>
+          <w:tcPr>
+            <w:tcW w:type="pct" w:w="12%"/>
+            <w:tcBorders>
+              <w:top w:val="single" w:color="D8D2D0" w:sz="1"/>
+              <w:left w:val="single" w:color="D8D2D0" w:sz="1"/>
+              <w:bottom w:val="single" w:color="D8D2D0" w:sz="1"/>
+              <w:right w:val="single" w:color="D8D2D0" w:sz="1"/>
+            </w:tcBorders>
+            <w:shd w:fill="F7F5F4" w:color="auto" w:val="clear"/>
+            <w:tcMar>
+              <w:top w:type="dxa" w:w="90"/>
+              <w:left w:type="dxa" w:w="120"/>
+              <w:bottom w:type="dxa" w:w="90"/>
+              <w:right w:type="dxa" w:w="120"/>
+            </w:tcMar>
+          </w:tcPr>
+          <w:p>
+            <w:pPr>
+              <w:spacing w:after="0" w:line="260"/>
+            </w:pPr>
+            <w:r>
+              <w:rPr>
+                <w:rFonts w:ascii="Arial" w:cs="Arial" w:eastAsia="Arial" w:hAnsi="Arial"/>
+                <w:b w:val="false"/>
+                <w:bCs w:val="false"/>
+                <w:color w:val="333333"/>
+                <w:sz w:val="19"/>
+                <w:szCs w:val="19"/>
+              </w:rPr>
+              <w:t xml:space="preserve">CO402</w:t>
+            </w:r>
+          </w:p>
+        </w:tc>
+        <w:tc>
+          <w:tcPr>
+            <w:tcW w:type="pct" w:w="38%"/>
+            <w:tcBorders>
+              <w:top w:val="single" w:color="D8D2D0" w:sz="1"/>
+              <w:left w:val="single" w:color="D8D2D0" w:sz="1"/>
+              <w:bottom w:val="single" w:color="D8D2D0" w:sz="1"/>
+              <w:right w:val="single" w:color="D8D2D0" w:sz="1"/>
+            </w:tcBorders>
+            <w:shd w:fill="F7F5F4" w:color="auto" w:val="clear"/>
+            <w:tcMar>
+              <w:top w:type="dxa" w:w="90"/>
+              <w:left w:type="dxa" w:w="120"/>
+              <w:bottom w:type="dxa" w:w="90"/>
+              <w:right w:type="dxa" w:w="120"/>
+            </w:tcMar>
+          </w:tcPr>
+          <w:p>
+            <w:pPr>
+              <w:spacing w:after="0" w:line="260"/>
+            </w:pPr>
+            <w:r>
+              <w:rPr>
+                <w:rFonts w:ascii="Arial" w:cs="Arial" w:eastAsia="Arial" w:hAnsi="Arial"/>
+                <w:b w:val="false"/>
+                <w:bCs w:val="false"/>
+                <w:color w:val="333333"/>
+                <w:sz w:val="19"/>
+                <w:szCs w:val="19"/>
+              </w:rPr>
+              <w:t xml:space="preserve">CARRO DE LVANDERIA DE PLASTICO MOD. HM-402…</w:t>
+            </w:r>
+          </w:p>
+        </w:tc>
+        <w:tc>
+          <w:tcPr>
+            <w:tcW w:type="pct" w:w="50%"/>
+            <w:tcBorders>
+              <w:top w:val="single" w:color="D8D2D0" w:sz="1"/>
+              <w:left w:val="single" w:color="D8D2D0" w:sz="1"/>
+              <w:bottom w:val="single" w:color="D8D2D0" w:sz="1"/>
+              <w:right w:val="single" w:color="D8D2D0" w:sz="1"/>
+            </w:tcBorders>
+            <w:shd w:fill="F7F5F4" w:color="auto" w:val="clear"/>
+            <w:tcMar>
+              <w:top w:type="dxa" w:w="90"/>
+              <w:left w:type="dxa" w:w="120"/>
+              <w:bottom w:type="dxa" w:w="90"/>
+              <w:right w:type="dxa" w:w="120"/>
+            </w:tcMar>
+          </w:tcPr>
+          <w:p>
+            <w:pPr>
+              <w:spacing w:after="0" w:line="260"/>
+            </w:pPr>
+            <w:r>
+              <w:rPr>
+                <w:rFonts w:ascii="Arial" w:cs="Arial" w:eastAsia="Arial" w:hAnsi="Arial"/>
+                <w:b w:val="false"/>
+                <w:bCs w:val="false"/>
+                <w:color w:val="333333"/>
+                <w:sz w:val="19"/>
+                <w:szCs w:val="19"/>
+              </w:rPr>
+              <w:t xml:space="preserve">LLEVA EL CODIGO DENTRO DE OTRO: CO402A-COCHE DE TRANSPORTE DE ROPA - HM…</w:t>
+            </w:r>
+          </w:p>
+        </w:tc>
+      </w:tr>
+      <w:tr>
+        <w:tc>
+          <w:tcPr>
+            <w:tcW w:type="pct" w:w="12%"/>
+            <w:tcBorders>
+              <w:top w:val="single" w:color="D8D2D0" w:sz="1"/>
+              <w:left w:val="single" w:color="D8D2D0" w:sz="1"/>
+              <w:bottom w:val="single" w:color="D8D2D0" w:sz="1"/>
+              <w:right w:val="single" w:color="D8D2D0" w:sz="1"/>
+            </w:tcBorders>
+            <w:tcMar>
+              <w:top w:type="dxa" w:w="90"/>
+              <w:left w:type="dxa" w:w="120"/>
+              <w:bottom w:type="dxa" w:w="90"/>
+              <w:right w:type="dxa" w:w="120"/>
+            </w:tcMar>
+          </w:tcPr>
+          <w:p>
+            <w:pPr>
+              <w:spacing w:after="0" w:line="260"/>
+            </w:pPr>
+            <w:r>
+              <w:rPr>
+                <w:rFonts w:ascii="Arial" w:cs="Arial" w:eastAsia="Arial" w:hAnsi="Arial"/>
+                <w:b w:val="false"/>
+                <w:bCs w:val="false"/>
+                <w:color w:val="333333"/>
+                <w:sz w:val="19"/>
+                <w:szCs w:val="19"/>
+              </w:rPr>
+              <w:t xml:space="preserve">CO408</w:t>
+            </w:r>
+          </w:p>
+        </w:tc>
+        <w:tc>
+          <w:tcPr>
+            <w:tcW w:type="pct" w:w="38%"/>
+            <w:tcBorders>
+              <w:top w:val="single" w:color="D8D2D0" w:sz="1"/>
+              <w:left w:val="single" w:color="D8D2D0" w:sz="1"/>
+              <w:bottom w:val="single" w:color="D8D2D0" w:sz="1"/>
+              <w:right w:val="single" w:color="D8D2D0" w:sz="1"/>
+            </w:tcBorders>
+            <w:tcMar>
+              <w:top w:type="dxa" w:w="90"/>
+              <w:left w:type="dxa" w:w="120"/>
+              <w:bottom w:type="dxa" w:w="90"/>
+              <w:right w:type="dxa" w:w="120"/>
+            </w:tcMar>
+          </w:tcPr>
+          <w:p>
+            <w:pPr>
+              <w:spacing w:after="0" w:line="260"/>
+            </w:pPr>
+            <w:r>
+              <w:rPr>
+                <w:rFonts w:ascii="Arial" w:cs="Arial" w:eastAsia="Arial" w:hAnsi="Arial"/>
+                <w:b w:val="false"/>
+                <w:bCs w:val="false"/>
+                <w:color w:val="333333"/>
+                <w:sz w:val="19"/>
+                <w:szCs w:val="19"/>
+              </w:rPr>
+              <w:t xml:space="preserve">CARRO DE LVANDERIA DE PLASTICO MOD. HM-408…</w:t>
+            </w:r>
+          </w:p>
+        </w:tc>
+        <w:tc>
+          <w:tcPr>
+            <w:tcW w:type="pct" w:w="50%"/>
+            <w:tcBorders>
+              <w:top w:val="single" w:color="D8D2D0" w:sz="1"/>
+              <w:left w:val="single" w:color="D8D2D0" w:sz="1"/>
+              <w:bottom w:val="single" w:color="D8D2D0" w:sz="1"/>
+              <w:right w:val="single" w:color="D8D2D0" w:sz="1"/>
+            </w:tcBorders>
+            <w:tcMar>
+              <w:top w:type="dxa" w:w="90"/>
+              <w:left w:type="dxa" w:w="120"/>
+              <w:bottom w:type="dxa" w:w="90"/>
+              <w:right w:type="dxa" w:w="120"/>
+            </w:tcMar>
+          </w:tcPr>
+          <w:p>
+            <w:pPr>
+              <w:spacing w:after="0" w:line="260"/>
+            </w:pPr>
+            <w:r>
+              <w:rPr>
+                <w:rFonts w:ascii="Arial" w:cs="Arial" w:eastAsia="Arial" w:hAnsi="Arial"/>
+                <w:b w:val="false"/>
+                <w:bCs w:val="false"/>
+                <w:color w:val="333333"/>
+                <w:sz w:val="19"/>
+                <w:szCs w:val="19"/>
+              </w:rPr>
+              <w:t xml:space="preserve">LLEVA EL CODIGO DENTRO DE OTRO: CO408A-COCHE DE TRANSPORTE DE ROPA HM 408…</w:t>
+            </w:r>
+          </w:p>
+        </w:tc>
+      </w:tr>
+      <w:tr>
+        <w:tc>
+          <w:tcPr>
+            <w:tcW w:type="pct" w:w="12%"/>
+            <w:tcBorders>
+              <w:top w:val="single" w:color="D8D2D0" w:sz="1"/>
+              <w:left w:val="single" w:color="D8D2D0" w:sz="1"/>
+              <w:bottom w:val="single" w:color="D8D2D0" w:sz="1"/>
+              <w:right w:val="single" w:color="D8D2D0" w:sz="1"/>
+            </w:tcBorders>
+            <w:shd w:fill="F7F5F4" w:color="auto" w:val="clear"/>
+            <w:tcMar>
+              <w:top w:type="dxa" w:w="90"/>
+              <w:left w:type="dxa" w:w="120"/>
+              <w:bottom w:type="dxa" w:w="90"/>
+              <w:right w:type="dxa" w:w="120"/>
+            </w:tcMar>
+          </w:tcPr>
+          <w:p>
+            <w:pPr>
+              <w:spacing w:after="0" w:line="260"/>
+            </w:pPr>
+            <w:r>
+              <w:rPr>
+                <w:rFonts w:ascii="Arial" w:cs="Arial" w:eastAsia="Arial" w:hAnsi="Arial"/>
+                <w:b w:val="false"/>
+                <w:bCs w:val="false"/>
+                <w:color w:val="333333"/>
+                <w:sz w:val="19"/>
+                <w:szCs w:val="19"/>
+              </w:rPr>
               <w:t xml:space="preserve">LAV135S</w:t>
             </w:r>
           </w:p>
@@ -3627,6 +4380,7 @@
               <w:bottom w:val="single" w:color="D8D2D0" w:sz="1"/>
               <w:right w:val="single" w:color="D8D2D0" w:sz="1"/>
             </w:tcBorders>
+            <w:shd w:fill="F7F5F4" w:color="auto" w:val="clear"/>
             <w:tcMar>
               <w:top w:type="dxa" w:w="90"/>
               <w:left w:type="dxa" w:w="120"/>
@@ -3660,6 +4414,7 @@
               <w:bottom w:val="single" w:color="D8D2D0" w:sz="1"/>
               <w:right w:val="single" w:color="D8D2D0" w:sz="1"/>
             </w:tcBorders>
+            <w:shd w:fill="F7F5F4" w:color="auto" w:val="clear"/>
             <w:tcMar>
               <w:top w:type="dxa" w:w="90"/>
               <w:left w:type="dxa" w:w="120"/>
@@ -3695,7 +4450,6 @@
               <w:bottom w:val="single" w:color="D8D2D0" w:sz="1"/>
               <w:right w:val="single" w:color="D8D2D0" w:sz="1"/>
             </w:tcBorders>
-            <w:shd w:fill="F7F5F4" w:color="auto" w:val="clear"/>
             <w:tcMar>
               <w:top w:type="dxa" w:w="90"/>
               <w:left w:type="dxa" w:w="120"/>
@@ -3729,7 +4483,6 @@
               <w:bottom w:val="single" w:color="D8D2D0" w:sz="1"/>
               <w:right w:val="single" w:color="D8D2D0" w:sz="1"/>
             </w:tcBorders>
-            <w:shd w:fill="F7F5F4" w:color="auto" w:val="clear"/>
             <w:tcMar>
               <w:top w:type="dxa" w:w="90"/>
               <w:left w:type="dxa" w:w="120"/>
@@ -3763,7 +4516,6 @@
               <w:bottom w:val="single" w:color="D8D2D0" w:sz="1"/>
               <w:right w:val="single" w:color="D8D2D0" w:sz="1"/>
             </w:tcBorders>
-            <w:shd w:fill="F7F5F4" w:color="auto" w:val="clear"/>
             <w:tcMar>
               <w:top w:type="dxa" w:w="90"/>
               <w:left w:type="dxa" w:w="120"/>
@@ -3799,6 +4551,7 @@
               <w:bottom w:val="single" w:color="D8D2D0" w:sz="1"/>
               <w:right w:val="single" w:color="D8D2D0" w:sz="1"/>
             </w:tcBorders>
+            <w:shd w:fill="F7F5F4" w:color="auto" w:val="clear"/>
             <w:tcMar>
               <w:top w:type="dxa" w:w="90"/>
               <w:left w:type="dxa" w:w="120"/>
@@ -3832,6 +4585,7 @@
               <w:bottom w:val="single" w:color="D8D2D0" w:sz="1"/>
               <w:right w:val="single" w:color="D8D2D0" w:sz="1"/>
             </w:tcBorders>
+            <w:shd w:fill="F7F5F4" w:color="auto" w:val="clear"/>
             <w:tcMar>
               <w:top w:type="dxa" w:w="90"/>
               <w:left w:type="dxa" w:w="120"/>
@@ -3865,6 +4619,7 @@
               <w:bottom w:val="single" w:color="D8D2D0" w:sz="1"/>
               <w:right w:val="single" w:color="D8D2D0" w:sz="1"/>
             </w:tcBorders>
+            <w:shd w:fill="F7F5F4" w:color="auto" w:val="clear"/>
             <w:tcMar>
               <w:top w:type="dxa" w:w="90"/>
               <w:left w:type="dxa" w:w="120"/>
@@ -3900,7 +4655,6 @@
               <w:bottom w:val="single" w:color="D8D2D0" w:sz="1"/>
               <w:right w:val="single" w:color="D8D2D0" w:sz="1"/>
             </w:tcBorders>
-            <w:shd w:fill="F7F5F4" w:color="auto" w:val="clear"/>
             <w:tcMar>
               <w:top w:type="dxa" w:w="90"/>
               <w:left w:type="dxa" w:w="120"/>
@@ -3934,7 +4688,6 @@
               <w:bottom w:val="single" w:color="D8D2D0" w:sz="1"/>
               <w:right w:val="single" w:color="D8D2D0" w:sz="1"/>
             </w:tcBorders>
-            <w:shd w:fill="F7F5F4" w:color="auto" w:val="clear"/>
             <w:tcMar>
               <w:top w:type="dxa" w:w="90"/>
               <w:left w:type="dxa" w:w="120"/>
@@ -3968,7 +4721,6 @@
               <w:bottom w:val="single" w:color="D8D2D0" w:sz="1"/>
               <w:right w:val="single" w:color="D8D2D0" w:sz="1"/>
             </w:tcBorders>
-            <w:shd w:fill="F7F5F4" w:color="auto" w:val="clear"/>
             <w:tcMar>
               <w:top w:type="dxa" w:w="90"/>
               <w:left w:type="dxa" w:w="120"/>
@@ -4004,6 +4756,7 @@
               <w:bottom w:val="single" w:color="D8D2D0" w:sz="1"/>
               <w:right w:val="single" w:color="D8D2D0" w:sz="1"/>
             </w:tcBorders>
+            <w:shd w:fill="F7F5F4" w:color="auto" w:val="clear"/>
             <w:tcMar>
               <w:top w:type="dxa" w:w="90"/>
               <w:left w:type="dxa" w:w="120"/>
@@ -4037,6 +4790,7 @@
               <w:bottom w:val="single" w:color="D8D2D0" w:sz="1"/>
               <w:right w:val="single" w:color="D8D2D0" w:sz="1"/>
             </w:tcBorders>
+            <w:shd w:fill="F7F5F4" w:color="auto" w:val="clear"/>
             <w:tcMar>
               <w:top w:type="dxa" w:w="90"/>
               <w:left w:type="dxa" w:w="120"/>
@@ -4070,6 +4824,7 @@
               <w:bottom w:val="single" w:color="D8D2D0" w:sz="1"/>
               <w:right w:val="single" w:color="D8D2D0" w:sz="1"/>
             </w:tcBorders>
+            <w:shd w:fill="F7F5F4" w:color="auto" w:val="clear"/>
             <w:tcMar>
               <w:top w:type="dxa" w:w="90"/>
               <w:left w:type="dxa" w:w="120"/>
@@ -4105,7 +4860,6 @@
               <w:bottom w:val="single" w:color="D8D2D0" w:sz="1"/>
               <w:right w:val="single" w:color="D8D2D0" w:sz="1"/>
             </w:tcBorders>
-            <w:shd w:fill="F7F5F4" w:color="auto" w:val="clear"/>
             <w:tcMar>
               <w:top w:type="dxa" w:w="90"/>
               <w:left w:type="dxa" w:w="120"/>
@@ -4139,7 +4893,6 @@
               <w:bottom w:val="single" w:color="D8D2D0" w:sz="1"/>
               <w:right w:val="single" w:color="D8D2D0" w:sz="1"/>
             </w:tcBorders>
-            <w:shd w:fill="F7F5F4" w:color="auto" w:val="clear"/>
             <w:tcMar>
               <w:top w:type="dxa" w:w="90"/>
               <w:left w:type="dxa" w:w="120"/>
@@ -4173,7 +4926,6 @@
               <w:bottom w:val="single" w:color="D8D2D0" w:sz="1"/>
               <w:right w:val="single" w:color="D8D2D0" w:sz="1"/>
             </w:tcBorders>
-            <w:shd w:fill="F7F5F4" w:color="auto" w:val="clear"/>
             <w:tcMar>
               <w:top w:type="dxa" w:w="90"/>
               <w:left w:type="dxa" w:w="120"/>
@@ -11308,7 +12060,7 @@
           <w:sz w:val="21"/>
           <w:szCs w:val="21"/>
         </w:rPr>
-        <w:t xml:space="preserve">Unificar los 8 códigos del punto 3: el mismo equipo está codificado de dos maneras en los Excels, y el CRM se queda con el que usted ponga en el maestro. Hoy esos equipos están sin descripción ni foto.</w:t>
+        <w:t xml:space="preserve">Unificar los 11 códigos del punto 3: el mismo equipo está codificado de dos maneras en los Excels, y el CRM se queda con el que usted ponga en el maestro. Hoy esos equipos están sin descripción ni foto.</w:t>
       </w:r>
     </w:p>
     <w:p>

</xml_diff>

<commit_message>
feat: entran las dos RX280 del libro nuevo de Lesly
El libro «Modificacion de precio y capacidad secadora ut120 26.08.26» estrenó
hoja LAVADORA con las dos versiones de la RX280 —boiler fed + preparado a
vapor, con puerto USB— y el maestro las fue a buscar a las carpetas de Lesly y
de Jean Paul: las dos tienen su Word.

  · LAV280   RX280 220V/1PH · US$ 22,500 → 14,900 · descripción nueva
  · LAV2801  RX280 380V/3PH · US$ 15,200 · producto nuevo, con su ficha y foto

El catálogo queda en 121 productos. El precio viejo de la LAV280 no se borra:
queda cerrado con fecha de hoy, que es lo que permite explicar una cotización
anterior.

Antes de cargar, las 121 cotizaciones de prueba pasaron la auditoría (regla de
docs/15): ningún texto fuera de su casilla, ninguna columna de más de cuatro
renglones, ningún resto de código de Word.

Co-Authored-By: Claude Opus 5 (1M context) <noreply@anthropic.com>
</commit_message>
<xml_diff>
--- a/docs/Fichas tecnicas cargadas al CRM - revision 28-08.docx
+++ b/docs/Fichas tecnicas cargadas al CRM - revision 28-08.docx
@@ -49,7 +49,7 @@
           <w:sz w:val="20"/>
           <w:szCs w:val="20"/>
         </w:rPr>
-        <w:t xml:space="preserve">Los 132 códigos del maestro de equipos v2 · 28 de agosto de 2026</w:t>
+        <w:t xml:space="preserve">Los 133 códigos del maestro de equipos v2 · 28 de agosto de 2026</w:t>
       </w:r>
     </w:p>
     <w:p>
@@ -249,7 +249,7 @@
                 <w:sz w:val="19"/>
                 <w:szCs w:val="19"/>
               </w:rPr>
-              <w:t xml:space="preserve">132</w:t>
+              <w:t xml:space="preserve">133</w:t>
             </w:r>
           </w:p>
         </w:tc>
@@ -319,7 +319,7 @@
                 <w:sz w:val="19"/>
                 <w:szCs w:val="19"/>
               </w:rPr>
-              <w:t xml:space="preserve">120</w:t>
+              <w:t xml:space="preserve">121</w:t>
             </w:r>
           </w:p>
         </w:tc>
@@ -541,7 +541,7 @@
                 <w:sz w:val="21"/>
                 <w:szCs w:val="21"/>
               </w:rPr>
-              <w:t xml:space="preserve">Ninguna de las 120 fichas cargadas quedó sin foto.</w:t>
+              <w:t xml:space="preserve">Ninguna de las 121 fichas cargadas quedó sin foto.</w:t>
             </w:r>
           </w:p>
           <w:p>
@@ -557,7 +557,7 @@
                 <w:sz w:val="21"/>
                 <w:szCs w:val="21"/>
               </w:rPr>
-              <w:t xml:space="preserve">Las 120 entraron con su foto del equipo, su descripción y los datos de la tabla de cabecera. Lo que sigue no impide cotizar: es lo que haría que las cotizaciones se vean mejor.</w:t>
+              <w:t xml:space="preserve">Las 121 entraron con su foto del equipo, su descripción y los datos de la tabla de cabecera. Lo que sigue no impide cotizar: es lo que haría que las cotizaciones se vean mejor.</w:t>
             </w:r>
           </w:p>
         </w:tc>
@@ -607,7 +607,7 @@
           <w:sz w:val="22"/>
           <w:szCs w:val="22"/>
         </w:rPr>
-        <w:t xml:space="preserve">Productos nuevos (7)</w:t>
+        <w:t xml:space="preserve">Productos nuevos (8)</w:t>
       </w:r>
     </w:p>
     <w:tbl>
@@ -1446,6 +1446,110 @@
                 <w:szCs w:val="19"/>
               </w:rPr>
               <w:t xml:space="preserve">16500.00</w:t>
+            </w:r>
+          </w:p>
+        </w:tc>
+      </w:tr>
+      <w:tr>
+        <w:tc>
+          <w:tcPr>
+            <w:tcW w:type="pct" w:w="14%"/>
+            <w:tcBorders>
+              <w:top w:val="single" w:color="D8D2D0" w:sz="1"/>
+              <w:left w:val="single" w:color="D8D2D0" w:sz="1"/>
+              <w:bottom w:val="single" w:color="D8D2D0" w:sz="1"/>
+              <w:right w:val="single" w:color="D8D2D0" w:sz="1"/>
+            </w:tcBorders>
+            <w:shd w:fill="F7F5F4" w:color="auto" w:val="clear"/>
+            <w:tcMar>
+              <w:top w:type="dxa" w:w="90"/>
+              <w:left w:type="dxa" w:w="120"/>
+              <w:bottom w:type="dxa" w:w="90"/>
+              <w:right w:type="dxa" w:w="120"/>
+            </w:tcMar>
+          </w:tcPr>
+          <w:p>
+            <w:pPr>
+              <w:spacing w:after="0" w:line="260"/>
+            </w:pPr>
+            <w:r>
+              <w:rPr>
+                <w:rFonts w:ascii="Arial" w:cs="Arial" w:eastAsia="Arial" w:hAnsi="Arial"/>
+                <w:b w:val="false"/>
+                <w:bCs w:val="false"/>
+                <w:color w:val="333333"/>
+                <w:sz w:val="19"/>
+                <w:szCs w:val="19"/>
+              </w:rPr>
+              <w:t xml:space="preserve">LAV2801</w:t>
+            </w:r>
+          </w:p>
+        </w:tc>
+        <w:tc>
+          <w:tcPr>
+            <w:tcW w:type="pct" w:w="66%"/>
+            <w:tcBorders>
+              <w:top w:val="single" w:color="D8D2D0" w:sz="1"/>
+              <w:left w:val="single" w:color="D8D2D0" w:sz="1"/>
+              <w:bottom w:val="single" w:color="D8D2D0" w:sz="1"/>
+              <w:right w:val="single" w:color="D8D2D0" w:sz="1"/>
+            </w:tcBorders>
+            <w:shd w:fill="F7F5F4" w:color="auto" w:val="clear"/>
+            <w:tcMar>
+              <w:top w:type="dxa" w:w="90"/>
+              <w:left w:type="dxa" w:w="120"/>
+              <w:bottom w:type="dxa" w:w="90"/>
+              <w:right w:type="dxa" w:w="120"/>
+            </w:tcMar>
+          </w:tcPr>
+          <w:p>
+            <w:pPr>
+              <w:spacing w:after="0" w:line="260"/>
+            </w:pPr>
+            <w:r>
+              <w:rPr>
+                <w:rFonts w:ascii="Arial" w:cs="Arial" w:eastAsia="Arial" w:hAnsi="Arial"/>
+                <w:b w:val="false"/>
+                <w:bCs w:val="false"/>
+                <w:color w:val="333333"/>
+                <w:sz w:val="19"/>
+                <w:szCs w:val="19"/>
+              </w:rPr>
+              <w:t xml:space="preserve">LAVADORA INDUSTRIAL</w:t>
+            </w:r>
+          </w:p>
+        </w:tc>
+        <w:tc>
+          <w:tcPr>
+            <w:tcW w:type="pct" w:w="20%"/>
+            <w:tcBorders>
+              <w:top w:val="single" w:color="D8D2D0" w:sz="1"/>
+              <w:left w:val="single" w:color="D8D2D0" w:sz="1"/>
+              <w:bottom w:val="single" w:color="D8D2D0" w:sz="1"/>
+              <w:right w:val="single" w:color="D8D2D0" w:sz="1"/>
+            </w:tcBorders>
+            <w:shd w:fill="F7F5F4" w:color="auto" w:val="clear"/>
+            <w:tcMar>
+              <w:top w:type="dxa" w:w="90"/>
+              <w:left w:type="dxa" w:w="120"/>
+              <w:bottom w:type="dxa" w:w="90"/>
+              <w:right w:type="dxa" w:w="120"/>
+            </w:tcMar>
+          </w:tcPr>
+          <w:p>
+            <w:pPr>
+              <w:spacing w:after="0" w:line="260"/>
+            </w:pPr>
+            <w:r>
+              <w:rPr>
+                <w:rFonts w:ascii="Arial" w:cs="Arial" w:eastAsia="Arial" w:hAnsi="Arial"/>
+                <w:b w:val="false"/>
+                <w:bCs w:val="false"/>
+                <w:color w:val="333333"/>
+                <w:sz w:val="19"/>
+                <w:szCs w:val="19"/>
+              </w:rPr>
+              <w:t xml:space="preserve">15200.00</w:t>
             </w:r>
           </w:p>
         </w:tc>
@@ -2646,7 +2750,7 @@
           <w:sz w:val="22"/>
           <w:szCs w:val="22"/>
         </w:rPr>
-        <w:t xml:space="preserve">Precios actualizados (13)</w:t>
+        <w:t xml:space="preserve">Precios actualizados (15)</w:t>
       </w:r>
     </w:p>
     <w:p>
@@ -3506,6 +3610,144 @@
                 <w:szCs w:val="19"/>
               </w:rPr>
               <w:t xml:space="preserve">16,500</w:t>
+            </w:r>
+          </w:p>
+        </w:tc>
+      </w:tr>
+      <w:tr>
+        <w:tc>
+          <w:tcPr>
+            <w:tcW w:type="pct" w:w="50%"/>
+            <w:tcBorders>
+              <w:top w:val="single" w:color="D8D2D0" w:sz="1"/>
+              <w:left w:val="single" w:color="D8D2D0" w:sz="1"/>
+              <w:bottom w:val="single" w:color="D8D2D0" w:sz="1"/>
+              <w:right w:val="single" w:color="D8D2D0" w:sz="1"/>
+            </w:tcBorders>
+            <w:shd w:fill="F7F5F4" w:color="auto" w:val="clear"/>
+            <w:tcMar>
+              <w:top w:type="dxa" w:w="90"/>
+              <w:left w:type="dxa" w:w="120"/>
+              <w:bottom w:type="dxa" w:w="90"/>
+              <w:right w:type="dxa" w:w="120"/>
+            </w:tcMar>
+          </w:tcPr>
+          <w:p>
+            <w:pPr>
+              <w:spacing w:after="0" w:line="260"/>
+            </w:pPr>
+            <w:r>
+              <w:rPr>
+                <w:rFonts w:ascii="Arial" w:cs="Arial" w:eastAsia="Arial" w:hAnsi="Arial"/>
+                <w:b w:val="false"/>
+                <w:bCs w:val="false"/>
+                <w:color w:val="333333"/>
+                <w:sz w:val="19"/>
+                <w:szCs w:val="19"/>
+              </w:rPr>
+              <w:t xml:space="preserve">LAV280</w:t>
+            </w:r>
+          </w:p>
+        </w:tc>
+        <w:tc>
+          <w:tcPr>
+            <w:tcW w:type="pct" w:w="50%"/>
+            <w:tcBorders>
+              <w:top w:val="single" w:color="D8D2D0" w:sz="1"/>
+              <w:left w:val="single" w:color="D8D2D0" w:sz="1"/>
+              <w:bottom w:val="single" w:color="D8D2D0" w:sz="1"/>
+              <w:right w:val="single" w:color="D8D2D0" w:sz="1"/>
+            </w:tcBorders>
+            <w:shd w:fill="F7F5F4" w:color="auto" w:val="clear"/>
+            <w:tcMar>
+              <w:top w:type="dxa" w:w="90"/>
+              <w:left w:type="dxa" w:w="120"/>
+              <w:bottom w:type="dxa" w:w="90"/>
+              <w:right w:type="dxa" w:w="120"/>
+            </w:tcMar>
+          </w:tcPr>
+          <w:p>
+            <w:pPr>
+              <w:spacing w:after="0" w:line="260"/>
+            </w:pPr>
+            <w:r>
+              <w:rPr>
+                <w:rFonts w:ascii="Arial" w:cs="Arial" w:eastAsia="Arial" w:hAnsi="Arial"/>
+                <w:b w:val="false"/>
+                <w:bCs w:val="false"/>
+                <w:color w:val="333333"/>
+                <w:sz w:val="19"/>
+                <w:szCs w:val="19"/>
+              </w:rPr>
+              <w:t xml:space="preserve">14,900</w:t>
+            </w:r>
+          </w:p>
+        </w:tc>
+      </w:tr>
+      <w:tr>
+        <w:tc>
+          <w:tcPr>
+            <w:tcW w:type="pct" w:w="50%"/>
+            <w:tcBorders>
+              <w:top w:val="single" w:color="D8D2D0" w:sz="1"/>
+              <w:left w:val="single" w:color="D8D2D0" w:sz="1"/>
+              <w:bottom w:val="single" w:color="D8D2D0" w:sz="1"/>
+              <w:right w:val="single" w:color="D8D2D0" w:sz="1"/>
+            </w:tcBorders>
+            <w:tcMar>
+              <w:top w:type="dxa" w:w="90"/>
+              <w:left w:type="dxa" w:w="120"/>
+              <w:bottom w:type="dxa" w:w="90"/>
+              <w:right w:type="dxa" w:w="120"/>
+            </w:tcMar>
+          </w:tcPr>
+          <w:p>
+            <w:pPr>
+              <w:spacing w:after="0" w:line="260"/>
+            </w:pPr>
+            <w:r>
+              <w:rPr>
+                <w:rFonts w:ascii="Arial" w:cs="Arial" w:eastAsia="Arial" w:hAnsi="Arial"/>
+                <w:b w:val="false"/>
+                <w:bCs w:val="false"/>
+                <w:color w:val="333333"/>
+                <w:sz w:val="19"/>
+                <w:szCs w:val="19"/>
+              </w:rPr>
+              <w:t xml:space="preserve">LAV2801</w:t>
+            </w:r>
+          </w:p>
+        </w:tc>
+        <w:tc>
+          <w:tcPr>
+            <w:tcW w:type="pct" w:w="50%"/>
+            <w:tcBorders>
+              <w:top w:val="single" w:color="D8D2D0" w:sz="1"/>
+              <w:left w:val="single" w:color="D8D2D0" w:sz="1"/>
+              <w:bottom w:val="single" w:color="D8D2D0" w:sz="1"/>
+              <w:right w:val="single" w:color="D8D2D0" w:sz="1"/>
+            </w:tcBorders>
+            <w:tcMar>
+              <w:top w:type="dxa" w:w="90"/>
+              <w:left w:type="dxa" w:w="120"/>
+              <w:bottom w:type="dxa" w:w="90"/>
+              <w:right w:type="dxa" w:w="120"/>
+            </w:tcMar>
+          </w:tcPr>
+          <w:p>
+            <w:pPr>
+              <w:spacing w:after="0" w:line="260"/>
+            </w:pPr>
+            <w:r>
+              <w:rPr>
+                <w:rFonts w:ascii="Arial" w:cs="Arial" w:eastAsia="Arial" w:hAnsi="Arial"/>
+                <w:b w:val="false"/>
+                <w:bCs w:val="false"/>
+                <w:color w:val="333333"/>
+                <w:sz w:val="19"/>
+                <w:szCs w:val="19"/>
+              </w:rPr>
+              <w:t xml:space="preserve">15,200</w:t>
             </w:r>
           </w:p>
         </w:tc>
@@ -6841,7 +7083,7 @@
           <w:sz w:val="21"/>
           <w:szCs w:val="21"/>
         </w:rPr>
-        <w:t xml:space="preserve">78 códigos comparten la foto del equipo con otro, en 28 grupos. En muchos casos es correcto —la misma máquina en distintas capacidades o calentamientos—, pero conviene confirmarlo grupo por grupo: si dos equipos no se ven iguales, el cliente recibe la foto de otro producto.</w:t>
+        <w:t xml:space="preserve">79 códigos comparten la foto del equipo con otro, en 28 grupos. En muchos casos es correcto —la misma máquina en distintas capacidades o calentamientos—, pero conviene confirmarlo grupo por grupo: si dos equipos no se ven iguales, el cliente recibe la foto de otro producto.</w:t>
       </w:r>
     </w:p>
     <w:tbl>
@@ -7212,7 +7454,7 @@
                 <w:sz w:val="19"/>
                 <w:szCs w:val="19"/>
               </w:rPr>
-              <w:t xml:space="preserve">LAV1355  ·  LAV2402  ·  LAV280</w:t>
+              <w:t xml:space="preserve">LAV1355  ·  LAV2402  ·  LAV280  ·  LAV2801</w:t>
             </w:r>
           </w:p>
         </w:tc>
@@ -11104,7 +11346,7 @@
           <w:sz w:val="22"/>
           <w:szCs w:val="22"/>
         </w:rPr>
-        <w:t xml:space="preserve">Tabla de cabecera incompleta (77 fichas)</w:t>
+        <w:t xml:space="preserve">Tabla de cabecera incompleta (78 fichas)</w:t>
       </w:r>
     </w:p>
     <w:p>
@@ -11118,7 +11360,7 @@
           <w:sz w:val="21"/>
           <w:szCs w:val="21"/>
         </w:rPr>
-        <w:t xml:space="preserve">La tabla del encabezado de la ficha alimenta los datos que el comercial ve al elegir el equipo. Falta calentamiento en 51 fichas, panel en 34 y capacidad en 17. El detalle está en el Excel.</w:t>
+        <w:t xml:space="preserve">La tabla del encabezado de la ficha alimenta los datos que el comercial ve al elegir el equipo. Falta calentamiento en 52 fichas, panel en 34 y capacidad en 17. El detalle está en el Excel.</w:t>
       </w:r>
     </w:p>
     <w:p>
@@ -11134,7 +11376,7 @@
           <w:sz w:val="22"/>
           <w:szCs w:val="22"/>
         </w:rPr>
-        <w:t xml:space="preserve">Sin vista de complemento (80 fichas)</w:t>
+        <w:t xml:space="preserve">Sin vista de complemento (81 fichas)</w:t>
       </w:r>
     </w:p>
     <w:p>

</xml_diff>